<commit_message>
updates and bug fix
</commit_message>
<xml_diff>
--- a/site_specific/pfas_background/Background concentration of PFAS in Groundwater.docx
+++ b/site_specific/pfas_background/Background concentration of PFAS in Groundwater.docx
@@ -1,6 +1,6 @@
 
 <file path=word/document.xml><?xml version="1.0" encoding="utf-8"?>
-<w:document xmlns:wpc="http://schemas.microsoft.com/office/word/2010/wordprocessingCanvas" xmlns:cx="http://schemas.microsoft.com/office/drawing/2014/chartex" xmlns:cx1="http://schemas.microsoft.com/office/drawing/2015/9/8/chartex" xmlns:cx2="http://schemas.microsoft.com/office/drawing/2015/10/21/chartex" xmlns:cx3="http://schemas.microsoft.com/office/drawing/2016/5/9/chartex" xmlns:cx4="http://schemas.microsoft.com/office/drawing/2016/5/10/chartex" xmlns:cx5="http://schemas.microsoft.com/office/drawing/2016/5/11/chartex" xmlns:cx6="http://schemas.microsoft.com/office/drawing/2016/5/12/chartex" xmlns:cx7="http://schemas.microsoft.com/office/drawing/2016/5/13/chartex" xmlns:cx8="http://schemas.microsoft.com/office/drawing/2016/5/14/chartex" xmlns:mc="http://schemas.openxmlformats.org/markup-compatibility/2006" xmlns:aink="http://schemas.microsoft.com/office/drawing/2016/ink" xmlns:am3d="http://schemas.microsoft.com/office/drawing/2017/model3d" xmlns:o="urn:schemas-microsoft-com:office:office" xmlns:oel="http://schemas.microsoft.com/office/2019/extlst" xmlns:r="http://schemas.openxmlformats.org/officeDocument/2006/relationships" xmlns:m="http://schemas.openxmlformats.org/officeDocument/2006/math" xmlns:v="urn:schemas-microsoft-com:vml" xmlns:wp14="http://schemas.microsoft.com/office/word/2010/wordprocessingDrawing" xmlns:wp="http://schemas.openxmlformats.org/drawingml/2006/wordprocessingDrawing" xmlns:w10="urn:schemas-microsoft-com:office:word" xmlns:w="http://schemas.openxmlformats.org/wordprocessingml/2006/main" xmlns:w14="http://schemas.microsoft.com/office/word/2010/wordml" xmlns:w15="http://schemas.microsoft.com/office/word/2012/wordml" xmlns:w16cei="http://schemas.microsoft.com/office/word/2026/wordml/cei" xmlns:w16cex="http://schemas.microsoft.com/office/word/2018/wordml/cex" xmlns:w16cid="http://schemas.microsoft.com/office/word/2016/wordml/cid" xmlns:w16="http://schemas.microsoft.com/office/word/2018/wordml" xmlns:w16du="http://schemas.microsoft.com/office/word/2023/wordml/word16du" xmlns:w16sdtdh="http://schemas.microsoft.com/office/word/2020/wordml/sdtdatahash" xmlns:w16sdtfl="http://schemas.microsoft.com/office/word/2024/wordml/sdtformatlock" xmlns:w16se="http://schemas.microsoft.com/office/word/2015/wordml/symex" xmlns:wpg="http://schemas.microsoft.com/office/word/2010/wordprocessingGroup" xmlns:wpi="http://schemas.microsoft.com/office/word/2010/wordprocessingInk" xmlns:wne="http://schemas.microsoft.com/office/word/2006/wordml" xmlns:wps="http://schemas.microsoft.com/office/word/2010/wordprocessingShape" mc:Ignorable="w14 w15 w16se w16cid w16 w16cex w16sdtdh w16sdtfl w16du wp14">
+<w:document xmlns:wpc="http://schemas.microsoft.com/office/word/2010/wordprocessingCanvas" xmlns:cx="http://schemas.microsoft.com/office/drawing/2014/chartex" xmlns:cx1="http://schemas.microsoft.com/office/drawing/2015/9/8/chartex" xmlns:cx2="http://schemas.microsoft.com/office/drawing/2015/10/21/chartex" xmlns:cx3="http://schemas.microsoft.com/office/drawing/2016/5/9/chartex" xmlns:cx4="http://schemas.microsoft.com/office/drawing/2016/5/10/chartex" xmlns:cx5="http://schemas.microsoft.com/office/drawing/2016/5/11/chartex" xmlns:cx6="http://schemas.microsoft.com/office/drawing/2016/5/12/chartex" xmlns:cx7="http://schemas.microsoft.com/office/drawing/2016/5/13/chartex" xmlns:cx8="http://schemas.microsoft.com/office/drawing/2016/5/14/chartex" xmlns:mc="http://schemas.openxmlformats.org/markup-compatibility/2006" xmlns:aink="http://schemas.microsoft.com/office/drawing/2016/ink" xmlns:am3d="http://schemas.microsoft.com/office/drawing/2017/model3d" xmlns:o="urn:schemas-microsoft-com:office:office" xmlns:oel="http://schemas.microsoft.com/office/2019/extlst" xmlns:r="http://schemas.openxmlformats.org/officeDocument/2006/relationships" xmlns:m="http://schemas.openxmlformats.org/officeDocument/2006/math" xmlns:v="urn:schemas-microsoft-com:vml" xmlns:wp14="http://schemas.microsoft.com/office/word/2010/wordprocessingDrawing" xmlns:wp="http://schemas.openxmlformats.org/drawingml/2006/wordprocessingDrawing" xmlns:w10="urn:schemas-microsoft-com:office:word" xmlns:w="http://schemas.openxmlformats.org/wordprocessingml/2006/main" xmlns:w14="http://schemas.microsoft.com/office/word/2010/wordml" xmlns:w15="http://schemas.microsoft.com/office/word/2012/wordml" xmlns:w16cex="http://schemas.microsoft.com/office/word/2018/wordml/cex" xmlns:w16cid="http://schemas.microsoft.com/office/word/2016/wordml/cid" xmlns:w16="http://schemas.microsoft.com/office/word/2018/wordml" xmlns:w16du="http://schemas.microsoft.com/office/word/2023/wordml/word16du" xmlns:w16sdtdh="http://schemas.microsoft.com/office/word/2020/wordml/sdtdatahash" xmlns:w16sdtfl="http://schemas.microsoft.com/office/word/2024/wordml/sdtformatlock" xmlns:w16se="http://schemas.microsoft.com/office/word/2015/wordml/symex" xmlns:wpg="http://schemas.microsoft.com/office/word/2010/wordprocessingGroup" xmlns:wpi="http://schemas.microsoft.com/office/word/2010/wordprocessingInk" xmlns:wne="http://schemas.microsoft.com/office/word/2006/wordml" xmlns:wps="http://schemas.microsoft.com/office/word/2010/wordprocessingShape" mc:Ignorable="w14 w15 w16se w16cid w16 w16cex w16sdtdh w16sdtfl w16du wp14">
   <w:body>
     <w:p>
       <w:pPr>
@@ -30,13 +30,8 @@
       <w:r>
         <w:t xml:space="preserve">Background concentration is either the naturally occurring ambient levels of contaminants in the environment or </w:t>
       </w:r>
-      <w:proofErr w:type="gramStart"/>
-      <w:r>
-        <w:t>concentrations</w:t>
-      </w:r>
-      <w:proofErr w:type="gramEnd"/>
-      <w:r>
-        <w:t xml:space="preserve"> as the result of human-generated, non-site-related sources</w:t>
+      <w:r>
+        <w:t>concentrations as the result of human-generated, non-site-related sources</w:t>
       </w:r>
       <w:r>
         <w:t xml:space="preserve">. As all PFAS compounds are synthetic, we are concerned with the later definition </w:t>
@@ -144,14 +139,12 @@
       <w:r>
         <w:t xml:space="preserve"> introduces an issue of what background values are </w:t>
       </w:r>
-      <w:proofErr w:type="gramStart"/>
       <w:r>
         <w:t xml:space="preserve">being </w:t>
       </w:r>
       <w:r>
         <w:t>estimating</w:t>
       </w:r>
-      <w:proofErr w:type="gramEnd"/>
       <w:r>
         <w:t xml:space="preserve"> here</w:t>
       </w:r>
@@ -177,15 +170,7 @@
         <w:t>.</w:t>
       </w:r>
       <w:r>
-        <w:t xml:space="preserve"> As </w:t>
-      </w:r>
-      <w:proofErr w:type="gramStart"/>
-      <w:r>
-        <w:t>a majority of</w:t>
-      </w:r>
-      <w:proofErr w:type="gramEnd"/>
-      <w:r>
-        <w:t xml:space="preserve"> the wells in this data set are drilled, it is more likely the analysis </w:t>
+        <w:t xml:space="preserve"> As a majority of the wells in this data set are drilled, it is more likely the analysis </w:t>
       </w:r>
       <w:r>
         <w:t xml:space="preserve">is more representative of intermediate or deep </w:t>
@@ -213,17 +198,8 @@
           <w:b/>
           <w:bCs/>
         </w:rPr>
-        <w:t xml:space="preserve">Frequency of </w:t>
-      </w:r>
-      <w:proofErr w:type="gramStart"/>
-      <w:r>
-        <w:rPr>
-          <w:b/>
-          <w:bCs/>
-        </w:rPr>
-        <w:t>Non-Detect</w:t>
-      </w:r>
-      <w:proofErr w:type="gramEnd"/>
+        <w:t>Frequency of Non-Detect</w:t>
+      </w:r>
     </w:p>
     <w:p>
       <w:pPr>
@@ -307,20 +283,15 @@
       <w:r>
         <w:t xml:space="preserve"> return non-</w:t>
       </w:r>
-      <w:proofErr w:type="gramStart"/>
       <w:r>
         <w:lastRenderedPageBreak/>
-        <w:t>detect</w:t>
-      </w:r>
-      <w:proofErr w:type="gramEnd"/>
-      <w:r>
-        <w:t xml:space="preserve"> for most or all PFAS compounds </w:t>
-      </w:r>
-      <w:r>
-        <w:t>increases the</w:t>
-      </w:r>
-      <w:r>
-        <w:t xml:space="preserve"> probability of non-detect being an accurate background concentration value.</w:t>
+        <w:t>detect for most or all PFAS compounds</w:t>
+      </w:r>
+      <w:r>
+        <w:t xml:space="preserve"> may be the simplest and most compelling argument for</w:t>
+      </w:r>
+      <w:r>
+        <w:t xml:space="preserve"> non-detect being an accurate background concentration value.</w:t>
       </w:r>
     </w:p>
     <w:p>
@@ -409,15 +380,13 @@
         <w:t>suggests</w:t>
       </w:r>
       <w:r>
-        <w:t xml:space="preserve"> that background concentration is at a non-</w:t>
-      </w:r>
-      <w:proofErr w:type="gramStart"/>
-      <w:r>
-        <w:t>detect</w:t>
-      </w:r>
-      <w:proofErr w:type="gramEnd"/>
-      <w:r>
-        <w:t xml:space="preserve"> level. </w:t>
+        <w:t xml:space="preserve"> that background concentration is at </w:t>
+      </w:r>
+      <w:r>
+        <w:t>the</w:t>
+      </w:r>
+      <w:r>
+        <w:t xml:space="preserve"> non-detect level. </w:t>
       </w:r>
       <w:r>
         <w:t xml:space="preserve">Figure 1 </w:t>
@@ -462,26 +431,10 @@
         <w:t xml:space="preserve"> </w:t>
       </w:r>
       <w:r>
-        <w:t xml:space="preserve">A third of </w:t>
-      </w:r>
-      <w:proofErr w:type="gramStart"/>
-      <w:r>
-        <w:t>samples,</w:t>
-      </w:r>
-      <w:proofErr w:type="gramEnd"/>
-      <w:r>
-        <w:t xml:space="preserve"> should be adequate </w:t>
-      </w:r>
-      <w:r>
-        <w:t>to demonstrate that finding non-</w:t>
-      </w:r>
-      <w:proofErr w:type="gramStart"/>
-      <w:r>
-        <w:t>detect</w:t>
-      </w:r>
-      <w:proofErr w:type="gramEnd"/>
-      <w:r>
-        <w:t xml:space="preserve"> levels of compounds is a common occurrence, especially given the expected bias of these</w:t>
+        <w:t xml:space="preserve">A third of samples, should be adequate </w:t>
+      </w:r>
+      <w:r>
+        <w:t>to demonstrate that finding non-detect levels of compounds is a common occurrence, especially given the expected bias of these</w:t>
       </w:r>
       <w:r>
         <w:t xml:space="preserve"> samples coming from areas where contamination is </w:t>
@@ -543,13 +496,8 @@
         <w:t xml:space="preserve"> </w:t>
       </w:r>
       <w:r>
-        <w:t xml:space="preserve">Plotting the location of non-detect sample results shows that the geographic distribution of non-detect results are distributed across all regions where samples are present. There are no regions with many samples (blue dots in figure 2) without some proximal non-detects (red dots in figure 2). There is bias of where PFAS groundwater samples exist, southern Maine and along the 95 </w:t>
-      </w:r>
-      <w:proofErr w:type="gramStart"/>
-      <w:r>
-        <w:t>corridor</w:t>
-      </w:r>
-      <w:proofErr w:type="gramEnd"/>
+        <w:t>Plotting the location of non-detect sample results shows that the geographic distribution of non-detect results are distributed across all regions where samples are present. There are no regions with many samples (blue dots in figure 2) without some proximal non-detects (red dots in figure 2). There is bias of where PFAS groundwater samples exist, southern Maine and along the 95 corridor</w:t>
+      </w:r>
       <w:r>
         <w:t xml:space="preserve">. This bias </w:t>
       </w:r>
@@ -566,15 +514,7 @@
         <w:t xml:space="preserve">[[what about non-detects in the </w:t>
       </w:r>
       <w:r>
-        <w:t xml:space="preserve">Fairfield </w:t>
-      </w:r>
-      <w:proofErr w:type="gramStart"/>
-      <w:r>
-        <w:t>area?]</w:t>
-      </w:r>
-      <w:proofErr w:type="gramEnd"/>
-      <w:r>
-        <w:t xml:space="preserve">] </w:t>
+        <w:t xml:space="preserve">Fairfield area?]] </w:t>
       </w:r>
     </w:p>
     <w:p>
@@ -718,7 +658,13 @@
         <w:t xml:space="preserve">) </w:t>
       </w:r>
       <w:r>
-        <w:t xml:space="preserve">Advective diffusive processes </w:t>
+        <w:t>Advective</w:t>
+      </w:r>
+      <w:r>
+        <w:t>-</w:t>
+      </w:r>
+      <w:r>
+        <w:t xml:space="preserve">diffusive processes </w:t>
       </w:r>
       <w:r>
         <w:t xml:space="preserve">that </w:t>
@@ -1085,13 +1031,8 @@
       <w:r>
         <w:t xml:space="preserve">The magnitude of the various parameters </w:t>
       </w:r>
-      <w:proofErr w:type="gramStart"/>
-      <w:r>
-        <w:t>vary</w:t>
-      </w:r>
-      <w:proofErr w:type="gramEnd"/>
-      <w:r>
-        <w:t xml:space="preserve"> across the state. The physical properties of </w:t>
+      <w:r>
+        <w:t xml:space="preserve">vary across the state. The physical properties of </w:t>
       </w:r>
       <w:r>
         <w:t xml:space="preserve">an aquifer range over many orders of magnitude. The amount of water </w:t>
@@ -1433,15 +1374,7 @@
         <w:jc w:val="center"/>
       </w:pPr>
       <w:r>
-        <w:t xml:space="preserve">Figure 3: </w:t>
-      </w:r>
-      <w:proofErr w:type="gramStart"/>
-      <w:r>
-        <w:t>Theis</w:t>
-      </w:r>
-      <w:proofErr w:type="gramEnd"/>
-      <w:r>
-        <w:t xml:space="preserve"> </w:t>
+        <w:t xml:space="preserve">Figure 3: Theis </w:t>
       </w:r>
       <w:r>
         <w:t xml:space="preserve">equation </w:t>
@@ -1579,6 +1512,9 @@
         <w:t xml:space="preserve"> is </w:t>
       </w:r>
       <w:r>
+        <w:t xml:space="preserve">y-axis </w:t>
+      </w:r>
+      <w:r>
         <w:t>truncated</w:t>
       </w:r>
       <w:r>
@@ -1605,13 +1541,8 @@
       <w:r>
         <w:t xml:space="preserve"> such as </w:t>
       </w:r>
-      <w:proofErr w:type="gramStart"/>
-      <w:r>
-        <w:t>1e</w:t>
-      </w:r>
-      <w:proofErr w:type="gramEnd"/>
-      <w:r>
-        <w:t>-5 m</w:t>
+      <w:r>
+        <w:t>1e-5 m</w:t>
       </w:r>
       <w:r>
         <w:t xml:space="preserve">, </w:t>
@@ -1670,18 +1601,10 @@
         <w:t>Choosing</w:t>
       </w:r>
       <w:r>
-        <w:t xml:space="preserve"> a single </w:t>
-      </w:r>
-      <w:proofErr w:type="gramStart"/>
-      <w:r>
-        <w:t xml:space="preserve">value </w:t>
-      </w:r>
-      <w:r>
-        <w:t>of</w:t>
-      </w:r>
-      <w:proofErr w:type="gramEnd"/>
-      <w:r>
-        <w:t xml:space="preserve"> </w:t>
+        <w:t xml:space="preserve"> a single value </w:t>
+      </w:r>
+      <w:r>
+        <w:t xml:space="preserve">of </w:t>
       </w:r>
       <w:r>
         <w:t xml:space="preserve">for the size of the cone of depression </w:t>
@@ -1741,7 +1664,7 @@
     </w:p>
     <w:p>
       <w:r>
-        <w:t xml:space="preserve">Advective and Diffusive processes service to mix and homogenous an aquifer. </w:t>
+        <w:t xml:space="preserve">Advective and Diffusive processes mix and homogenous an aquifer. </w:t>
       </w:r>
       <w:r>
         <w:t xml:space="preserve">How rapidly and over what length scales this occurs can also serve </w:t>
@@ -1883,24 +1806,11 @@
       <w:r>
         <w:t xml:space="preserve">(L) </w:t>
       </w:r>
-      <w:proofErr w:type="gramStart"/>
-      <w:r>
-        <w:t>over</w:t>
-      </w:r>
-      <w:proofErr w:type="gramEnd"/>
-      <w:r>
-        <w:t xml:space="preserve"> 30 years</w:t>
-      </w:r>
-      <w:r>
-        <w:t xml:space="preserve"> </w:t>
-      </w:r>
-      <w:proofErr w:type="gramStart"/>
-      <w:r>
-        <w:t xml:space="preserve">(t </w:t>
-      </w:r>
-      <w:proofErr w:type="gramEnd"/>
-      <w:r>
-        <w:t>but in seconds)</w:t>
+      <w:r>
+        <w:t>over 30 years</w:t>
+      </w:r>
+      <w:r>
+        <w:t xml:space="preserve"> (t but in seconds)</w:t>
       </w:r>
       <w:r>
         <w:t xml:space="preserve"> </w:t>
@@ -1962,26 +1872,10 @@
         <w:t xml:space="preserve">But the distance the ground water moves suggests </w:t>
       </w:r>
       <w:r>
-        <w:t>a distance over which a sample could be representative. A non-</w:t>
-      </w:r>
-      <w:proofErr w:type="gramStart"/>
-      <w:r>
-        <w:t>detect</w:t>
-      </w:r>
-      <w:proofErr w:type="gramEnd"/>
-      <w:r>
-        <w:t xml:space="preserve"> result should also serve </w:t>
-      </w:r>
-      <w:r>
-        <w:t xml:space="preserve">suggest that the aquifer upgradient of the sample is also free from the </w:t>
-      </w:r>
-      <w:proofErr w:type="gramStart"/>
-      <w:r>
-        <w:t>contaminate</w:t>
-      </w:r>
-      <w:proofErr w:type="gramEnd"/>
-      <w:r>
-        <w:t xml:space="preserve"> of concern. </w:t>
+        <w:t xml:space="preserve">a distance over which a sample could be representative. A non-detect result should </w:t>
+      </w:r>
+      <w:r>
+        <w:t xml:space="preserve">suggest that the aquifer upgradient of the sample is also free from the contaminate of concern. </w:t>
       </w:r>
     </w:p>
     <w:p>
@@ -2046,7 +1940,19 @@
         <w:t>onte Carlo simulation</w:t>
       </w:r>
       <w:r>
-        <w:t>, with 1e6 solutions,</w:t>
+        <w:t xml:space="preserve">, with </w:t>
+      </w:r>
+      <w:r>
+        <w:t>10</w:t>
+      </w:r>
+      <w:r>
+        <w:rPr>
+          <w:vertAlign w:val="superscript"/>
+        </w:rPr>
+        <w:t>6</w:t>
+      </w:r>
+      <w:r>
+        <w:t xml:space="preserve"> solutions,</w:t>
       </w:r>
       <w:r>
         <w:t xml:space="preserve"> is chosen to get a probability distribution function </w:t>
@@ -2356,10 +2262,16 @@
         <w:t xml:space="preserve">000 m. </w:t>
       </w:r>
       <w:r>
-        <w:t xml:space="preserve">There is of course a directionality </w:t>
-      </w:r>
-      <w:r>
-        <w:t xml:space="preserve">to this distance, but as a first attempt the distance is applied in all directions uniformly. </w:t>
+        <w:t xml:space="preserve">There is a directionality </w:t>
+      </w:r>
+      <w:r>
+        <w:t>to this distance, but as a</w:t>
+      </w:r>
+      <w:r>
+        <w:t>n initial estimate</w:t>
+      </w:r>
+      <w:r>
+        <w:t xml:space="preserve"> the distance is applied in all directions uniformly. </w:t>
       </w:r>
     </w:p>
     <w:p>
@@ -2460,15 +2372,7 @@
         <w:t xml:space="preserve"> representative distance from the </w:t>
       </w:r>
       <w:r>
-        <w:t xml:space="preserve">cone of depression is probably less than 50 </w:t>
-      </w:r>
-      <w:proofErr w:type="gramStart"/>
-      <w:r>
-        <w:t>m, but</w:t>
-      </w:r>
-      <w:proofErr w:type="gramEnd"/>
-      <w:r>
-        <w:t xml:space="preserve"> could be up to 2000 and the estimate from plug flow is </w:t>
+        <w:t xml:space="preserve">cone of depression is probably less than 50 m, but could be up to 2000 and the estimate from plug flow is </w:t>
       </w:r>
       <w:r>
         <w:t xml:space="preserve">about </w:t>
@@ -2477,23 +2381,15 @@
         <w:t>100 to 200</w:t>
       </w:r>
       <w:r>
-        <w:t xml:space="preserve"> meters. These two values can be </w:t>
-      </w:r>
-      <w:proofErr w:type="gramStart"/>
-      <w:r>
-        <w:t>additive</w:t>
-      </w:r>
-      <w:proofErr w:type="gramEnd"/>
+        <w:t xml:space="preserve"> meters. These two values can be additive </w:t>
+      </w:r>
+      <w:r>
+        <w:t>but the final estimate is</w:t>
+      </w:r>
       <w:r>
         <w:t xml:space="preserve"> </w:t>
       </w:r>
       <w:r>
-        <w:t>but the final estimate is</w:t>
-      </w:r>
-      <w:r>
-        <w:t xml:space="preserve"> </w:t>
-      </w:r>
-      <w:r>
         <w:t>li</w:t>
       </w:r>
       <w:r>
@@ -2515,23 +2411,13 @@
         <w:t xml:space="preserve">[[use </w:t>
       </w:r>
       <w:r>
-        <w:t xml:space="preserve">sand and </w:t>
-      </w:r>
-      <w:proofErr w:type="spellStart"/>
-      <w:r>
-        <w:t>grave</w:t>
-      </w:r>
-      <w:proofErr w:type="spellEnd"/>
-      <w:r>
-        <w:t xml:space="preserve"> aquifer locations as the most mixed and the </w:t>
-      </w:r>
-      <w:proofErr w:type="gramStart"/>
-      <w:r>
-        <w:t>mostly</w:t>
-      </w:r>
-      <w:proofErr w:type="gramEnd"/>
-      <w:r>
-        <w:t xml:space="preserve"> likely to have broad representation of aquifer state]]</w:t>
+        <w:t>sand and grave</w:t>
+      </w:r>
+      <w:r>
+        <w:t>l</w:t>
+      </w:r>
+      <w:r>
+        <w:t xml:space="preserve"> aquifer locations as the most mixed and the mostly likely to have broad representation of aquifer state]]</w:t>
       </w:r>
     </w:p>
     <w:p>
@@ -2544,7 +2430,68 @@
         <w:rPr>
           <w:rFonts w:eastAsiaTheme="minorEastAsia"/>
         </w:rPr>
+        <w:t xml:space="preserve">[[map showing where the ND would cover aerially, one using </w:t>
+      </w:r>
+      <w:r>
+        <w:rPr>
+          <w:rFonts w:eastAsiaTheme="minorEastAsia"/>
+        </w:rPr>
+        <w:t>2</w:t>
+      </w:r>
+      <w:r>
+        <w:rPr>
+          <w:rFonts w:eastAsiaTheme="minorEastAsia"/>
+        </w:rPr>
+        <w:t>00 m and 2000 m</w:t>
+      </w:r>
+      <w:r>
+        <w:rPr>
+          <w:rFonts w:eastAsiaTheme="minorEastAsia"/>
+        </w:rPr>
+        <w:t xml:space="preserve">]] </w:t>
+      </w:r>
+      <w:r>
+        <w:rPr>
+          <w:rFonts w:eastAsiaTheme="minorEastAsia"/>
+        </w:rPr>
         <w:br/>
+      </w:r>
+    </w:p>
+    <w:p>
+      <w:pPr>
+        <w:rPr>
+          <w:rFonts w:eastAsiaTheme="minorEastAsia"/>
+        </w:rPr>
+      </w:pPr>
+      <w:r>
+        <w:rPr>
+          <w:rFonts w:eastAsiaTheme="minorEastAsia"/>
+        </w:rPr>
+        <w:t xml:space="preserve">[[map of locations furthest from known </w:t>
+      </w:r>
+      <w:r>
+        <w:rPr>
+          <w:rFonts w:eastAsiaTheme="minorEastAsia"/>
+        </w:rPr>
+        <w:t>PFAS source</w:t>
+      </w:r>
+      <w:r>
+        <w:rPr>
+          <w:rFonts w:eastAsiaTheme="minorEastAsia"/>
+        </w:rPr>
+        <w:t xml:space="preserve">s; </w:t>
+      </w:r>
+      <w:r>
+        <w:rPr>
+          <w:rFonts w:eastAsiaTheme="minorEastAsia"/>
+        </w:rPr>
+        <w:t>LD1600 and landfills</w:t>
+      </w:r>
+      <w:r>
+        <w:rPr>
+          <w:rFonts w:eastAsiaTheme="minorEastAsia"/>
+        </w:rPr>
+        <w:t>]]</w:t>
       </w:r>
     </w:p>
     <w:p>
@@ -2594,7 +2541,7 @@
 </file>
 
 <file path=word/numbering.xml><?xml version="1.0" encoding="utf-8"?>
-<w:numbering xmlns:wpc="http://schemas.microsoft.com/office/word/2010/wordprocessingCanvas" xmlns:cx="http://schemas.microsoft.com/office/drawing/2014/chartex" xmlns:cx1="http://schemas.microsoft.com/office/drawing/2015/9/8/chartex" xmlns:cx2="http://schemas.microsoft.com/office/drawing/2015/10/21/chartex" xmlns:cx3="http://schemas.microsoft.com/office/drawing/2016/5/9/chartex" xmlns:cx4="http://schemas.microsoft.com/office/drawing/2016/5/10/chartex" xmlns:cx5="http://schemas.microsoft.com/office/drawing/2016/5/11/chartex" xmlns:cx6="http://schemas.microsoft.com/office/drawing/2016/5/12/chartex" xmlns:cx7="http://schemas.microsoft.com/office/drawing/2016/5/13/chartex" xmlns:cx8="http://schemas.microsoft.com/office/drawing/2016/5/14/chartex" xmlns:mc="http://schemas.openxmlformats.org/markup-compatibility/2006" xmlns:aink="http://schemas.microsoft.com/office/drawing/2016/ink" xmlns:am3d="http://schemas.microsoft.com/office/drawing/2017/model3d" xmlns:o="urn:schemas-microsoft-com:office:office" xmlns:oel="http://schemas.microsoft.com/office/2019/extlst" xmlns:r="http://schemas.openxmlformats.org/officeDocument/2006/relationships" xmlns:m="http://schemas.openxmlformats.org/officeDocument/2006/math" xmlns:v="urn:schemas-microsoft-com:vml" xmlns:wp14="http://schemas.microsoft.com/office/word/2010/wordprocessingDrawing" xmlns:wp="http://schemas.openxmlformats.org/drawingml/2006/wordprocessingDrawing" xmlns:w10="urn:schemas-microsoft-com:office:word" xmlns:w="http://schemas.openxmlformats.org/wordprocessingml/2006/main" xmlns:w14="http://schemas.microsoft.com/office/word/2010/wordml" xmlns:w15="http://schemas.microsoft.com/office/word/2012/wordml" xmlns:w16cei="http://schemas.microsoft.com/office/word/2026/wordml/cei" xmlns:w16cex="http://schemas.microsoft.com/office/word/2018/wordml/cex" xmlns:w16cid="http://schemas.microsoft.com/office/word/2016/wordml/cid" xmlns:w16="http://schemas.microsoft.com/office/word/2018/wordml" xmlns:w16du="http://schemas.microsoft.com/office/word/2023/wordml/word16du" xmlns:w16sdtdh="http://schemas.microsoft.com/office/word/2020/wordml/sdtdatahash" xmlns:w16sdtfl="http://schemas.microsoft.com/office/word/2024/wordml/sdtformatlock" xmlns:w16se="http://schemas.microsoft.com/office/word/2015/wordml/symex" xmlns:wpg="http://schemas.microsoft.com/office/word/2010/wordprocessingGroup" xmlns:wpi="http://schemas.microsoft.com/office/word/2010/wordprocessingInk" xmlns:wne="http://schemas.microsoft.com/office/word/2006/wordml" xmlns:wps="http://schemas.microsoft.com/office/word/2010/wordprocessingShape" mc:Ignorable="w14 w15 w16se w16cid w16 w16cex w16sdtdh w16sdtfl w16du wp14">
+<w:numbering xmlns:wpc="http://schemas.microsoft.com/office/word/2010/wordprocessingCanvas" xmlns:cx="http://schemas.microsoft.com/office/drawing/2014/chartex" xmlns:cx1="http://schemas.microsoft.com/office/drawing/2015/9/8/chartex" xmlns:cx2="http://schemas.microsoft.com/office/drawing/2015/10/21/chartex" xmlns:cx3="http://schemas.microsoft.com/office/drawing/2016/5/9/chartex" xmlns:cx4="http://schemas.microsoft.com/office/drawing/2016/5/10/chartex" xmlns:cx5="http://schemas.microsoft.com/office/drawing/2016/5/11/chartex" xmlns:cx6="http://schemas.microsoft.com/office/drawing/2016/5/12/chartex" xmlns:cx7="http://schemas.microsoft.com/office/drawing/2016/5/13/chartex" xmlns:cx8="http://schemas.microsoft.com/office/drawing/2016/5/14/chartex" xmlns:mc="http://schemas.openxmlformats.org/markup-compatibility/2006" xmlns:aink="http://schemas.microsoft.com/office/drawing/2016/ink" xmlns:am3d="http://schemas.microsoft.com/office/drawing/2017/model3d" xmlns:o="urn:schemas-microsoft-com:office:office" xmlns:oel="http://schemas.microsoft.com/office/2019/extlst" xmlns:r="http://schemas.openxmlformats.org/officeDocument/2006/relationships" xmlns:m="http://schemas.openxmlformats.org/officeDocument/2006/math" xmlns:v="urn:schemas-microsoft-com:vml" xmlns:wp14="http://schemas.microsoft.com/office/word/2010/wordprocessingDrawing" xmlns:wp="http://schemas.openxmlformats.org/drawingml/2006/wordprocessingDrawing" xmlns:w10="urn:schemas-microsoft-com:office:word" xmlns:w="http://schemas.openxmlformats.org/wordprocessingml/2006/main" xmlns:w14="http://schemas.microsoft.com/office/word/2010/wordml" xmlns:w15="http://schemas.microsoft.com/office/word/2012/wordml" xmlns:w16cex="http://schemas.microsoft.com/office/word/2018/wordml/cex" xmlns:w16cid="http://schemas.microsoft.com/office/word/2016/wordml/cid" xmlns:w16="http://schemas.microsoft.com/office/word/2018/wordml" xmlns:w16du="http://schemas.microsoft.com/office/word/2023/wordml/word16du" xmlns:w16sdtdh="http://schemas.microsoft.com/office/word/2020/wordml/sdtdatahash" xmlns:w16sdtfl="http://schemas.microsoft.com/office/word/2024/wordml/sdtformatlock" xmlns:w16se="http://schemas.microsoft.com/office/word/2015/wordml/symex" xmlns:wpg="http://schemas.microsoft.com/office/word/2010/wordprocessingGroup" xmlns:wpi="http://schemas.microsoft.com/office/word/2010/wordprocessingInk" xmlns:wne="http://schemas.microsoft.com/office/word/2006/wordml" xmlns:wps="http://schemas.microsoft.com/office/word/2010/wordprocessingShape" mc:Ignorable="w14 w15 w16se w16cid w16 w16cex w16sdtdh w16sdtfl w16du wp14">
   <w:abstractNum w:abstractNumId="0" w15:restartNumberingAfterBreak="0">
     <w:nsid w:val="1C051AAC"/>
     <w:multiLevelType w:val="hybridMultilevel"/>

</xml_diff>

<commit_message>
minor updates and corrections
</commit_message>
<xml_diff>
--- a/site_specific/pfas_background/Background concentration of PFAS in Groundwater.docx
+++ b/site_specific/pfas_background/Background concentration of PFAS in Groundwater.docx
@@ -137,13 +137,10 @@
         <w:t>A lack of control</w:t>
       </w:r>
       <w:r>
-        <w:t xml:space="preserve"> introduces an issue of what background values are </w:t>
-      </w:r>
-      <w:r>
-        <w:t xml:space="preserve">being </w:t>
-      </w:r>
-      <w:r>
-        <w:t>estimating</w:t>
+        <w:t xml:space="preserve"> introduces an issue of what background values are estimat</w:t>
+      </w:r>
+      <w:r>
+        <w:t>ed</w:t>
       </w:r>
       <w:r>
         <w:t xml:space="preserve"> here</w:t>
@@ -152,16 +149,19 @@
         <w:t xml:space="preserve">. It is expected that groundwater near the water table </w:t>
       </w:r>
       <w:r>
-        <w:t>would have a higher likelihood of contamination than water deep in the aquifer. Without controls on what depth in the aquifer the water sample represents, what background value we are estimating isn’t fully known (e.g. shallow, intermediate, or deep).</w:t>
-      </w:r>
-      <w:r>
-        <w:t xml:space="preserve"> This analysis </w:t>
-      </w:r>
-      <w:r>
-        <w:t xml:space="preserve">then </w:t>
-      </w:r>
-      <w:r>
-        <w:t xml:space="preserve">effectively flattens the aquifer </w:t>
+        <w:t>would have a higher likelihood of contamination than water deep in the aquifer. Without controls on what depth in the aquifer the water sample represents</w:t>
+      </w:r>
+      <w:r>
+        <w:t>,</w:t>
+      </w:r>
+      <w:r>
+        <w:t xml:space="preserve"> </w:t>
+      </w:r>
+      <w:r>
+        <w:t>t</w:t>
+      </w:r>
+      <w:r>
+        <w:t xml:space="preserve">his analysis effectively flattens the aquifer </w:t>
       </w:r>
       <w:r>
         <w:t>and assumes consistency with depth</w:t>
@@ -170,7 +170,19 @@
         <w:t>.</w:t>
       </w:r>
       <w:r>
-        <w:t xml:space="preserve"> As a majority of the wells in this data set are drilled, it is more likely the analysis </w:t>
+        <w:t xml:space="preserve"> </w:t>
+      </w:r>
+      <w:r>
+        <w:t>However, most</w:t>
+      </w:r>
+      <w:r>
+        <w:t xml:space="preserve"> wells in this data set are drilled</w:t>
+      </w:r>
+      <w:r>
+        <w:t xml:space="preserve"> and</w:t>
+      </w:r>
+      <w:r>
+        <w:t xml:space="preserve"> it is likely the analysis </w:t>
       </w:r>
       <w:r>
         <w:t xml:space="preserve">is more representative of intermediate or deep </w:t>
@@ -257,7 +269,13 @@
         <w:t>s within this dataset</w:t>
       </w:r>
       <w:r>
-        <w:t xml:space="preserve"> than from </w:t>
+        <w:t xml:space="preserve"> than </w:t>
+      </w:r>
+      <w:r>
+        <w:t>would be observed from</w:t>
+      </w:r>
+      <w:r>
+        <w:t xml:space="preserve"> </w:t>
       </w:r>
       <w:r>
         <w:t>random sampling across the sta</w:t>
@@ -281,24 +299,21 @@
         <w:t xml:space="preserve"> in this dataset</w:t>
       </w:r>
       <w:r>
-        <w:t xml:space="preserve"> return non-</w:t>
-      </w:r>
-      <w:r>
+        <w:t xml:space="preserve"> return non-detect for most or all PFAS compounds</w:t>
+      </w:r>
+      <w:r>
+        <w:t xml:space="preserve"> may be the simplest and most compelling argument for</w:t>
+      </w:r>
+      <w:r>
+        <w:t xml:space="preserve"> non-detect being an accurate background concentration value.</w:t>
+      </w:r>
+    </w:p>
+    <w:p>
+      <w:r>
+        <w:rPr>
+          <w:noProof/>
+        </w:rPr>
         <w:lastRenderedPageBreak/>
-        <w:t>detect for most or all PFAS compounds</w:t>
-      </w:r>
-      <w:r>
-        <w:t xml:space="preserve"> may be the simplest and most compelling argument for</w:t>
-      </w:r>
-      <w:r>
-        <w:t xml:space="preserve"> non-detect being an accurate background concentration value.</w:t>
-      </w:r>
-    </w:p>
-    <w:p>
-      <w:r>
-        <w:rPr>
-          <w:noProof/>
-        </w:rPr>
         <w:drawing>
           <wp:inline distT="0" distB="0" distL="0" distR="0" wp14:anchorId="5539E39A" wp14:editId="70829257">
             <wp:extent cx="5486400" cy="3429000"/>
@@ -454,69 +469,23 @@
           <w:bCs/>
         </w:rPr>
       </w:pPr>
-      <w:r>
+    </w:p>
+    <w:p>
+      <w:pPr>
         <w:rPr>
           <w:b/>
           <w:bCs/>
         </w:rPr>
-        <w:t xml:space="preserve">Geographic Variability </w:t>
-      </w:r>
-    </w:p>
-    <w:p>
-      <w:r>
-        <w:lastRenderedPageBreak/>
-        <w:tab/>
-        <w:t xml:space="preserve">It’s possible that there is regional variability of background level because of heterogeneity in the depositional or </w:t>
-      </w:r>
-      <w:r>
-        <w:t>distributive</w:t>
-      </w:r>
-      <w:r>
+      </w:pPr>
+      <w:r>
+        <w:rPr>
+          <w:b/>
+          <w:bCs/>
+        </w:rPr>
         <w:t xml:space="preserve"> </w:t>
       </w:r>
-      <w:r>
-        <w:t>processes</w:t>
-      </w:r>
-      <w:r>
-        <w:t xml:space="preserve"> that influence </w:t>
-      </w:r>
-      <w:r>
-        <w:t>background</w:t>
-      </w:r>
-      <w:r>
-        <w:t xml:space="preserve"> PFAS </w:t>
-      </w:r>
-      <w:r>
-        <w:t>concentrations that would make</w:t>
-      </w:r>
-      <w:r>
-        <w:t xml:space="preserve"> a single statewide value inappropriate.</w:t>
-      </w:r>
-      <w:r>
-        <w:t xml:space="preserve"> </w:t>
-      </w:r>
-      <w:r>
-        <w:t>Plotting the location of non-detect sample results shows that the geographic distribution of non-detect results are distributed across all regions where samples are present. There are no regions with many samples (blue dots in figure 2) without some proximal non-detects (red dots in figure 2). There is bias of where PFAS groundwater samples exist, southern Maine and along the 95 corridor</w:t>
-      </w:r>
-      <w:r>
-        <w:t xml:space="preserve">. This bias </w:t>
-      </w:r>
-      <w:r>
-        <w:t xml:space="preserve">is related to population density and sludge distribution logistics.  </w:t>
-      </w:r>
-      <w:r>
-        <w:br/>
-      </w:r>
     </w:p>
     <w:p/>
-    <w:p>
-      <w:r>
-        <w:t xml:space="preserve">[[what about non-detects in the </w:t>
-      </w:r>
-      <w:r>
-        <w:t xml:space="preserve">Fairfield area?]] </w:t>
-      </w:r>
-    </w:p>
     <w:p>
       <w:pPr>
         <w:sectPr>
@@ -529,17 +498,31 @@
     </w:p>
     <w:p>
       <w:pPr>
+        <w:rPr>
+          <w:noProof/>
+        </w:rPr>
+      </w:pPr>
+      <w:r>
+        <w:rPr>
+          <w:b/>
+          <w:bCs/>
+        </w:rPr>
+        <w:lastRenderedPageBreak/>
+        <w:t>Geographic Variability</w:t>
+      </w:r>
+    </w:p>
+    <w:p>
+      <w:pPr>
         <w:jc w:val="center"/>
       </w:pPr>
       <w:r>
         <w:rPr>
           <w:noProof/>
         </w:rPr>
-        <w:lastRenderedPageBreak/>
         <w:drawing>
-          <wp:inline distT="0" distB="0" distL="0" distR="0" wp14:anchorId="3514026B" wp14:editId="15FC9D2F">
-            <wp:extent cx="8229600" cy="5630545"/>
-            <wp:effectExtent l="0" t="0" r="0" b="8255"/>
+          <wp:inline distT="0" distB="0" distL="0" distR="0" wp14:anchorId="3514026B" wp14:editId="35B0C31F">
+            <wp:extent cx="8229600" cy="5188585"/>
+            <wp:effectExtent l="0" t="0" r="0" b="0"/>
             <wp:docPr id="2111193756" name="basic_map.png"/>
             <wp:cNvGraphicFramePr>
               <a:graphicFrameLocks xmlns:a="http://schemas.openxmlformats.org/drawingml/2006/main" noChangeAspect="1"/>
@@ -551,20 +534,29 @@
                     <pic:cNvPr id="2111193756" name="basic_map.png"/>
                     <pic:cNvPicPr/>
                   </pic:nvPicPr>
-                  <pic:blipFill>
+                  <pic:blipFill rotWithShape="1">
                     <a:blip r:link="rId6"/>
+                    <a:srcRect t="7849"/>
                     <a:stretch>
                       <a:fillRect/>
                     </a:stretch>
                   </pic:blipFill>
-                  <pic:spPr>
+                  <pic:spPr bwMode="auto">
                     <a:xfrm>
                       <a:off x="0" y="0"/>
-                      <a:ext cx="8229600" cy="5630545"/>
+                      <a:ext cx="8229600" cy="5188585"/>
                     </a:xfrm>
                     <a:prstGeom prst="rect">
                       <a:avLst/>
                     </a:prstGeom>
+                    <a:ln>
+                      <a:noFill/>
+                    </a:ln>
+                    <a:extLst>
+                      <a:ext uri="{53640926-AAD7-44D8-BBD7-CCE9431645EC}">
+                        <a14:shadowObscured xmlns:a14="http://schemas.microsoft.com/office/drawing/2010/main"/>
+                      </a:ext>
+                    </a:extLst>
                   </pic:spPr>
                 </pic:pic>
               </a:graphicData>
@@ -588,138 +580,285 @@
     </w:p>
     <w:p>
       <w:pPr>
+        <w:ind w:firstLine="720"/>
+      </w:pPr>
+      <w:r>
+        <w:lastRenderedPageBreak/>
+        <w:t xml:space="preserve">It’s possible that there is regional variability of background level because of </w:t>
+      </w:r>
+      <w:r>
+        <w:t xml:space="preserve">spatial </w:t>
+      </w:r>
+      <w:r>
+        <w:t>heterogeneity in the depositional or distributive processes that influence background PFAS concentrations that would make a single statewide value inappropriate. Plotting the location of non-detect sample results shows that the geographic distribution of non-detect results are distributed across all regions where samples are present. There are no regions with many samples</w:t>
+      </w:r>
+      <w:r>
+        <w:t xml:space="preserve"> with detections</w:t>
+      </w:r>
+      <w:r>
+        <w:t xml:space="preserve"> (blue dots in figure 2) without some proximal non-detects (red dots in figure 2). There is bias of where PFAS groundwater samples exist, southern Maine and along the 95 corridor. This bias is related to population density and sludge distribution logistics.  </w:t>
+      </w:r>
+    </w:p>
+    <w:p>
+      <w:pPr>
+        <w:ind w:firstLine="720"/>
+      </w:pPr>
+      <w:r>
+        <w:t xml:space="preserve">To demonstrate the spatial concentration of site-related sources, all the samples in Fairfield, ME, where many of the highest PFAS concentration in groundwater exists, are analyzed. In Fairfield, 36% of samples are non-detect from PFOS, 17% are non-detect of PFOA, and 16% are non-detect for sum of 6. </w:t>
+      </w:r>
+    </w:p>
+    <w:p>
+      <w:r>
+        <w:rPr>
+          <w:noProof/>
+        </w:rPr>
+        <w:drawing>
+          <wp:inline distT="0" distB="0" distL="0" distR="0" wp14:anchorId="21AFA390" wp14:editId="6A228694">
+            <wp:extent cx="5913985" cy="1952625"/>
+            <wp:effectExtent l="0" t="0" r="0" b="0"/>
+            <wp:docPr id="4967661" name="Picture 1"/>
+            <wp:cNvGraphicFramePr>
+              <a:graphicFrameLocks xmlns:a="http://schemas.openxmlformats.org/drawingml/2006/main" noChangeAspect="1"/>
+            </wp:cNvGraphicFramePr>
+            <a:graphic xmlns:a="http://schemas.openxmlformats.org/drawingml/2006/main">
+              <a:graphicData uri="http://schemas.openxmlformats.org/drawingml/2006/picture">
+                <pic:pic xmlns:pic="http://schemas.openxmlformats.org/drawingml/2006/picture">
+                  <pic:nvPicPr>
+                    <pic:cNvPr id="0" name="Picture 1"/>
+                    <pic:cNvPicPr>
+                      <a:picLocks noChangeAspect="1" noChangeArrowheads="1"/>
+                    </pic:cNvPicPr>
+                  </pic:nvPicPr>
+                  <pic:blipFill rotWithShape="1">
+                    <a:blip r:embed="rId7" cstate="print">
+                      <a:extLst>
+                        <a:ext uri="{28A0092B-C50C-407E-A947-70E740481C1C}">
+                          <a14:useLocalDpi xmlns:a14="http://schemas.microsoft.com/office/drawing/2010/main" val="0"/>
+                        </a:ext>
+                      </a:extLst>
+                    </a:blip>
+                    <a:srcRect l="6422" t="31126" r="8988" b="30464"/>
+                    <a:stretch>
+                      <a:fillRect/>
+                    </a:stretch>
+                  </pic:blipFill>
+                  <pic:spPr bwMode="auto">
+                    <a:xfrm>
+                      <a:off x="0" y="0"/>
+                      <a:ext cx="5920677" cy="1954835"/>
+                    </a:xfrm>
+                    <a:prstGeom prst="rect">
+                      <a:avLst/>
+                    </a:prstGeom>
+                    <a:noFill/>
+                    <a:ln>
+                      <a:noFill/>
+                    </a:ln>
+                    <a:extLst>
+                      <a:ext uri="{53640926-AAD7-44D8-BBD7-CCE9431645EC}">
+                        <a14:shadowObscured xmlns:a14="http://schemas.microsoft.com/office/drawing/2010/main"/>
+                      </a:ext>
+                    </a:extLst>
+                  </pic:spPr>
+                </pic:pic>
+              </a:graphicData>
+            </a:graphic>
+          </wp:inline>
+        </w:drawing>
+      </w:r>
+    </w:p>
+    <w:p>
+      <w:pPr>
+        <w:jc w:val="center"/>
+      </w:pPr>
+      <w:r>
+        <w:t xml:space="preserve">Figure </w:t>
+      </w:r>
+      <w:r>
+        <w:t xml:space="preserve">3. </w:t>
+      </w:r>
+      <w:r>
+        <w:t>Prevalence of non-detect results in Fairfield, ME.</w:t>
+      </w:r>
+    </w:p>
+    <w:p/>
+    <w:p>
+      <w:pPr>
+        <w:ind w:firstLine="720"/>
+      </w:pPr>
+      <w:r>
+        <w:t xml:space="preserve">In an area of maximum PFAS impact, and using samples that collected through the expectation of higher risk from site-related contamination, non-detect samples are </w:t>
+      </w:r>
+      <w:r>
+        <w:t xml:space="preserve">still </w:t>
+      </w:r>
+      <w:r>
+        <w:t>found across the region. Finding background concentrations is more difficult in Fairfield than in other areas of the state, but the background values in Fairfield are likely to be non-detect.</w:t>
+      </w:r>
+    </w:p>
+    <w:p>
+      <w:pPr>
         <w:rPr>
           <w:b/>
           <w:bCs/>
         </w:rPr>
       </w:pPr>
-      <w:r>
+    </w:p>
+    <w:p>
+      <w:pPr>
         <w:rPr>
           <w:b/>
           <w:bCs/>
         </w:rPr>
-        <w:lastRenderedPageBreak/>
-        <w:t>Aquifer Mixing / representative distance</w:t>
-      </w:r>
-    </w:p>
-    <w:p>
-      <w:r>
-        <w:t xml:space="preserve">How </w:t>
-      </w:r>
-      <w:r>
-        <w:t>representative a sample is to the broader aquifer</w:t>
-      </w:r>
-      <w:r>
-        <w:t xml:space="preserve"> is</w:t>
-      </w:r>
-      <w:r>
-        <w:t xml:space="preserve"> dependent on numerous </w:t>
-      </w:r>
-      <w:r>
-        <w:t>physical processes</w:t>
-      </w:r>
-      <w:r>
-        <w:t xml:space="preserve"> and </w:t>
-      </w:r>
-      <w:r>
-        <w:t>could</w:t>
-      </w:r>
-      <w:r>
-        <w:t xml:space="preserve"> be estimated in </w:t>
-      </w:r>
-      <w:r>
-        <w:t>multiple</w:t>
-      </w:r>
-      <w:r>
-        <w:t xml:space="preserve"> ways.</w:t>
-      </w:r>
-      <w:r>
-        <w:t xml:space="preserve"> </w:t>
-      </w:r>
-      <w:r>
-        <w:t xml:space="preserve">A conservative estimate is the volume from which a well physically </w:t>
-      </w:r>
-      <w:r>
-        <w:t>draws water. This volume is related to a</w:t>
-      </w:r>
-      <w:r>
-        <w:t xml:space="preserve">) </w:t>
-      </w:r>
-      <w:r>
-        <w:t>The</w:t>
-      </w:r>
-      <w:r>
-        <w:t xml:space="preserve"> distance that is equal to the cone of depression of the well</w:t>
-      </w:r>
-      <w:r>
-        <w:t xml:space="preserve"> and b</w:t>
-      </w:r>
-      <w:r>
-        <w:t xml:space="preserve">) </w:t>
-      </w:r>
-      <w:r>
-        <w:t>Advective</w:t>
-      </w:r>
-      <w:r>
-        <w:t>-</w:t>
-      </w:r>
-      <w:r>
-        <w:t xml:space="preserve">diffusive processes </w:t>
-      </w:r>
-      <w:r>
-        <w:t xml:space="preserve">that </w:t>
-      </w:r>
-      <w:r>
-        <w:t>mix an aquifer.</w:t>
-      </w:r>
-      <w:r>
-        <w:t xml:space="preserve"> </w:t>
-      </w:r>
-      <w:r>
-        <w:t>However, a water sample can be representative of a volume/area</w:t>
-      </w:r>
-      <w:r>
-        <w:t xml:space="preserve"> from which it does not directly sample. For instance, i</w:t>
-      </w:r>
-      <w:r>
-        <w:t>f an aquifer is completely and instantaneously mixed, one sample anywhere would be representative of the entire volume.  Of course, physical processes occur at a much slower rate, but estimating</w:t>
-      </w:r>
-      <w:r>
-        <w:t xml:space="preserve"> the m</w:t>
-      </w:r>
-      <w:r>
-        <w:t>ixing time o</w:t>
-      </w:r>
-      <w:r>
-        <w:t>r</w:t>
-      </w:r>
-      <w:r>
-        <w:t xml:space="preserve"> distance of the aquifer</w:t>
-      </w:r>
-      <w:r>
-        <w:t xml:space="preserve"> would inform the magnitude of a representative distance from a sample location that should be chemical</w:t>
-      </w:r>
-      <w:r>
-        <w:t>ly</w:t>
-      </w:r>
-      <w:r>
-        <w:t xml:space="preserve"> consistent</w:t>
-      </w:r>
-      <w:r>
-        <w:t xml:space="preserve"> or, conversely, unimpacted by distributed land application of pfas containing fluids.</w:t>
-      </w:r>
-    </w:p>
-    <w:p/>
-    <w:p>
+      </w:pPr>
       <w:r>
         <w:rPr>
           <w:b/>
           <w:bCs/>
         </w:rPr>
+        <w:t>Aquifer Mixing / representative distance</w:t>
+      </w:r>
+    </w:p>
+    <w:p>
+      <w:pPr>
+        <w:ind w:firstLine="720"/>
+      </w:pPr>
+      <w:r>
+        <w:t xml:space="preserve">How </w:t>
+      </w:r>
+      <w:r>
+        <w:t>representative a sample is to the broader aquifer</w:t>
+      </w:r>
+      <w:r>
+        <w:t xml:space="preserve"> is</w:t>
+      </w:r>
+      <w:r>
+        <w:t xml:space="preserve"> dependent on numerous </w:t>
+      </w:r>
+      <w:r>
+        <w:t>physical processes</w:t>
+      </w:r>
+      <w:r>
+        <w:t xml:space="preserve"> and </w:t>
+      </w:r>
+      <w:r>
+        <w:t>could</w:t>
+      </w:r>
+      <w:r>
+        <w:t xml:space="preserve"> be estimated in </w:t>
+      </w:r>
+      <w:r>
+        <w:t>multiple</w:t>
+      </w:r>
+      <w:r>
+        <w:t xml:space="preserve"> ways.</w:t>
+      </w:r>
+      <w:r>
+        <w:t xml:space="preserve"> </w:t>
+      </w:r>
+      <w:r>
+        <w:t xml:space="preserve">A conservative estimate is the volume from which a well physically </w:t>
+      </w:r>
+      <w:r>
+        <w:t>draws water. This volume is related to a</w:t>
+      </w:r>
+      <w:r>
+        <w:t xml:space="preserve">) </w:t>
+      </w:r>
+      <w:r>
+        <w:t>t</w:t>
+      </w:r>
+      <w:r>
+        <w:t>he</w:t>
+      </w:r>
+      <w:r>
+        <w:t xml:space="preserve"> distance </w:t>
+      </w:r>
+      <w:r>
+        <w:lastRenderedPageBreak/>
+        <w:t>that is equal to the cone of depression of the well</w:t>
+      </w:r>
+      <w:r>
+        <w:t xml:space="preserve"> and b</w:t>
+      </w:r>
+      <w:r>
+        <w:t xml:space="preserve">) </w:t>
+      </w:r>
+      <w:r>
+        <w:t>a</w:t>
+      </w:r>
+      <w:r>
+        <w:t>dvective</w:t>
+      </w:r>
+      <w:r>
+        <w:t>-</w:t>
+      </w:r>
+      <w:r>
+        <w:t xml:space="preserve">diffusive processes </w:t>
+      </w:r>
+      <w:r>
+        <w:t xml:space="preserve">that </w:t>
+      </w:r>
+      <w:r>
+        <w:t>mix an aquifer.</w:t>
+      </w:r>
+      <w:r>
+        <w:t xml:space="preserve"> </w:t>
+      </w:r>
+      <w:r>
+        <w:t>However, a water sample can be representative of a volume/area</w:t>
+      </w:r>
+      <w:r>
+        <w:t xml:space="preserve"> from which it does not directly sample. For instance, i</w:t>
+      </w:r>
+      <w:r>
+        <w:t>f an aquifer is completely and instantaneously mixed, one sample anywhere would be representative of the entire volume.  Of course, physical processes occur at a much slower rate, but estimating</w:t>
+      </w:r>
+      <w:r>
+        <w:t xml:space="preserve"> the m</w:t>
+      </w:r>
+      <w:r>
+        <w:t>ixing time o</w:t>
+      </w:r>
+      <w:r>
+        <w:t>r</w:t>
+      </w:r>
+      <w:r>
+        <w:t xml:space="preserve"> distance of the aquifer</w:t>
+      </w:r>
+      <w:r>
+        <w:t xml:space="preserve"> would inform the magnitude of a representative distance from a sample location that should be chemical</w:t>
+      </w:r>
+      <w:r>
+        <w:t>ly</w:t>
+      </w:r>
+      <w:r>
+        <w:t xml:space="preserve"> consistent</w:t>
+      </w:r>
+      <w:r>
+        <w:t xml:space="preserve"> or, conversely, unimpacted by distributed land application of </w:t>
+      </w:r>
+      <w:r>
+        <w:t>PFAS</w:t>
+      </w:r>
+      <w:r>
+        <w:t xml:space="preserve"> containing fluids.</w:t>
+      </w:r>
+    </w:p>
+    <w:p/>
+    <w:p>
+      <w:r>
+        <w:rPr>
+          <w:b/>
+          <w:bCs/>
+        </w:rPr>
         <w:t>Cone of Depression</w:t>
       </w:r>
     </w:p>
     <w:p>
+      <w:pPr>
+        <w:ind w:firstLine="720"/>
+      </w:pPr>
       <w:r>
         <w:t xml:space="preserve">The cone of depression </w:t>
       </w:r>
@@ -757,7 +896,13 @@
         <w:t xml:space="preserve">(dh) at some distance (r) from the well location. The distance where </w:t>
       </w:r>
       <w:r>
-        <w:t xml:space="preserve">dh approaches or becomes equal to zero can be taken as </w:t>
+        <w:t xml:space="preserve">dh </w:t>
+      </w:r>
+      <w:r>
+        <w:t xml:space="preserve">sufficiently </w:t>
+      </w:r>
+      <w:r>
+        <w:t xml:space="preserve">approaches zero can be taken as </w:t>
       </w:r>
       <w:r>
         <w:t>a</w:t>
@@ -778,10 +923,28 @@
         <w:t xml:space="preserve">e change in head </w:t>
       </w:r>
       <w:r>
-        <w:t xml:space="preserve">is a function of the rate what is removed from the well (Q), the </w:t>
-      </w:r>
-      <w:r>
-        <w:t>specific yield of the of the aquifer (S</w:t>
+        <w:t xml:space="preserve">is a function of </w:t>
+      </w:r>
+      <w:r>
+        <w:t>water</w:t>
+      </w:r>
+      <w:r>
+        <w:t xml:space="preserve"> </w:t>
+      </w:r>
+      <w:r>
+        <w:t>flux</w:t>
+      </w:r>
+      <w:r>
+        <w:t xml:space="preserve"> </w:t>
+      </w:r>
+      <w:r>
+        <w:t>out of</w:t>
+      </w:r>
+      <w:r>
+        <w:t xml:space="preserve"> the well (Q), the </w:t>
+      </w:r>
+      <w:r>
+        <w:t>specific yield of the aquifer (S</w:t>
       </w:r>
       <w:r>
         <w:rPr>
@@ -826,7 +989,13 @@
         <w:t>aquifer</w:t>
       </w:r>
       <w:r>
-        <w:t xml:space="preserve"> thickness and needs to be sufficiently larger than </w:t>
+        <w:t xml:space="preserve"> thickness </w:t>
+      </w:r>
+      <w:r>
+        <w:t>that</w:t>
+      </w:r>
+      <w:r>
+        <w:t xml:space="preserve"> needs to be sufficiently larger than </w:t>
       </w:r>
       <w:r>
         <w:t>the magnitude of dh or the assumption</w:t>
@@ -1024,6 +1193,7 @@
     </w:p>
     <w:p>
       <w:pPr>
+        <w:ind w:firstLine="720"/>
         <w:rPr>
           <w:rFonts w:eastAsiaTheme="minorEastAsia"/>
         </w:rPr>
@@ -1083,7 +1253,6 @@
         <w:t xml:space="preserve">ility </w:t>
       </w:r>
       <w:r>
-        <w:lastRenderedPageBreak/>
         <w:t>distribution function.</w:t>
       </w:r>
       <w:r>
@@ -1206,6 +1375,7 @@
           </w:tcPr>
           <w:p>
             <w:r>
+              <w:lastRenderedPageBreak/>
               <w:t>Hydraulic Conductivity (K)</w:t>
             </w:r>
           </w:p>
@@ -1337,7 +1507,7 @@
                     </pic:cNvPicPr>
                   </pic:nvPicPr>
                   <pic:blipFill>
-                    <a:blip r:embed="rId7" cstate="print">
+                    <a:blip r:embed="rId8" cstate="print">
                       <a:extLst>
                         <a:ext uri="{28A0092B-C50C-407E-A947-70E740481C1C}">
                           <a14:useLocalDpi xmlns:a14="http://schemas.microsoft.com/office/drawing/2010/main" val="0"/>
@@ -1374,7 +1544,13 @@
         <w:jc w:val="center"/>
       </w:pPr>
       <w:r>
-        <w:t xml:space="preserve">Figure 3: Theis </w:t>
+        <w:t xml:space="preserve">Figure </w:t>
+      </w:r>
+      <w:r>
+        <w:t>4</w:t>
+      </w:r>
+      <w:r>
+        <w:t xml:space="preserve">: Theis </w:t>
       </w:r>
       <w:r>
         <w:t xml:space="preserve">equation </w:t>
@@ -1383,15 +1559,7 @@
         <w:t xml:space="preserve">Monte Carlo Results. The </w:t>
       </w:r>
       <w:r>
-        <w:t xml:space="preserve">y-axis is truncated and the first bin of </w:t>
-      </w:r>
-      <w:proofErr w:type="spellStart"/>
-      <w:r>
-        <w:t>Thres</w:t>
-      </w:r>
-      <w:proofErr w:type="spellEnd"/>
-      <w:r>
-        <w:t>=0.005 (blue) extends to greater than 0.69.</w:t>
+        <w:t>y-axis is truncated and the first bin of Thres=0.005 (blue) extends to greater than 0.69.</w:t>
       </w:r>
     </w:p>
     <w:p/>
@@ -1433,16 +1601,28 @@
         <w:t xml:space="preserve">, which is considered sufficiently long to </w:t>
       </w:r>
       <w:r>
-        <w:t xml:space="preserve">be in </w:t>
-      </w:r>
-      <w:r>
-        <w:t>in a minimal rate of growth. T</w:t>
-      </w:r>
-      <w:r>
-        <w:t xml:space="preserve">hen </w:t>
-      </w:r>
-      <w:r>
-        <w:t xml:space="preserve">a dh threshold </w:t>
+        <w:t>be</w:t>
+      </w:r>
+      <w:r>
+        <w:t xml:space="preserve"> </w:t>
+      </w:r>
+      <w:r>
+        <w:t xml:space="preserve">at a </w:t>
+      </w:r>
+      <w:r>
+        <w:t>minimal growth</w:t>
+      </w:r>
+      <w:r>
+        <w:t xml:space="preserve"> rate</w:t>
+      </w:r>
+      <w:r>
+        <w:t xml:space="preserve">. </w:t>
+      </w:r>
+      <w:r>
+        <w:t>A</w:t>
+      </w:r>
+      <w:r>
+        <w:t xml:space="preserve"> dh threshold </w:t>
       </w:r>
       <w:r>
         <w:t xml:space="preserve">is chosen where any value less than </w:t>
@@ -1451,110 +1631,125 @@
         <w:t>a</w:t>
       </w:r>
       <w:r>
+        <w:t xml:space="preserve"> threshold </w:t>
+      </w:r>
+      <w:r>
+        <w:t>is</w:t>
+      </w:r>
+      <w:r>
         <w:t xml:space="preserve"> </w:t>
       </w:r>
       <w:r>
+        <w:t xml:space="preserve">considered </w:t>
+      </w:r>
+      <w:r>
+        <w:t xml:space="preserve">unaffected by </w:t>
+      </w:r>
+      <w:r>
+        <w:t xml:space="preserve">well </w:t>
+      </w:r>
+      <w:r>
+        <w:t xml:space="preserve">pumping. </w:t>
+      </w:r>
+      <w:r>
+        <w:t xml:space="preserve">What threshold to use isn’t readily clear and </w:t>
+      </w:r>
+      <w:r>
+        <w:t>F</w:t>
+      </w:r>
+      <w:r>
+        <w:t xml:space="preserve">igure </w:t>
+      </w:r>
+      <w:r>
+        <w:t>4</w:t>
+      </w:r>
+      <w:r>
+        <w:t xml:space="preserve"> shows </w:t>
+      </w:r>
+      <w:r>
+        <w:t>four</w:t>
+      </w:r>
+      <w:r>
+        <w:t xml:space="preserve"> potential values. When the value gets sufficiently large, such as for </w:t>
+      </w:r>
+      <w:r>
+        <w:t>0.005 m</w:t>
+      </w:r>
+      <w:r>
+        <w:t xml:space="preserve"> in figure </w:t>
+      </w:r>
+      <w:r>
+        <w:t>4</w:t>
+      </w:r>
+      <w:r>
+        <w:t>, the results start to collapse into the first distance bin of the histogram.</w:t>
+      </w:r>
+      <w:r>
+        <w:t xml:space="preserve"> </w:t>
+      </w:r>
+      <w:r>
+        <w:t xml:space="preserve">The y-axis of </w:t>
+      </w:r>
+      <w:r>
+        <w:t xml:space="preserve">Figure </w:t>
+      </w:r>
+      <w:r>
+        <w:t>4</w:t>
+      </w:r>
+      <w:r>
+        <w:t xml:space="preserve"> </w:t>
+      </w:r>
+      <w:r>
+        <w:t>i</w:t>
+      </w:r>
+      <w:r>
+        <w:t xml:space="preserve">s </w:t>
+      </w:r>
+      <w:r>
+        <w:t>truncated</w:t>
+      </w:r>
+      <w:r>
+        <w:t xml:space="preserve"> and </w:t>
+      </w:r>
+      <w:r>
+        <w:t xml:space="preserve">nearly 70% of the results have a cone of depression less than 50 m. </w:t>
+      </w:r>
+      <w:r>
+        <w:t>A</w:t>
+      </w:r>
+      <w:r>
+        <w:t>n a</w:t>
+      </w:r>
+      <w:r>
+        <w:t xml:space="preserve">rbitrarily small </w:t>
+      </w:r>
+      <w:r>
+        <w:t>threshold</w:t>
+      </w:r>
+      <w:r>
+        <w:t>,</w:t>
+      </w:r>
+      <w:r>
+        <w:t xml:space="preserve"> such as </w:t>
+      </w:r>
+      <w:r>
+        <w:t>1e-5 m</w:t>
+      </w:r>
+      <w:r>
+        <w:t xml:space="preserve">, </w:t>
+      </w:r>
+      <w:r>
+        <w:t xml:space="preserve">significantly </w:t>
+      </w:r>
+      <w:r>
+        <w:t xml:space="preserve">extends </w:t>
+      </w:r>
+      <w:r>
+        <w:t xml:space="preserve">the </w:t>
+      </w:r>
+      <w:r>
         <w:lastRenderedPageBreak/>
-        <w:t xml:space="preserve">threshold </w:t>
-      </w:r>
-      <w:r>
-        <w:t>is</w:t>
-      </w:r>
-      <w:r>
-        <w:t xml:space="preserve"> unaffected by </w:t>
-      </w:r>
-      <w:r>
-        <w:t xml:space="preserve">well </w:t>
-      </w:r>
-      <w:r>
-        <w:t xml:space="preserve">pumping. </w:t>
-      </w:r>
-      <w:r>
-        <w:t xml:space="preserve">What threshold to use isn’t readily clear and </w:t>
-      </w:r>
-      <w:r>
-        <w:t>F</w:t>
-      </w:r>
-      <w:r>
-        <w:t xml:space="preserve">igure </w:t>
-      </w:r>
-      <w:r>
-        <w:t>3</w:t>
-      </w:r>
-      <w:r>
-        <w:t xml:space="preserve"> shows </w:t>
-      </w:r>
-      <w:r>
-        <w:t>four</w:t>
-      </w:r>
-      <w:r>
-        <w:t xml:space="preserve"> potential values. When the value gets sufficiently large, such as for </w:t>
-      </w:r>
-      <w:r>
-        <w:t>0.005 m</w:t>
-      </w:r>
-      <w:r>
-        <w:t xml:space="preserve"> in figure </w:t>
-      </w:r>
-      <w:r>
-        <w:t>3</w:t>
-      </w:r>
-      <w:r>
-        <w:t>, the results start to collapse into the first distance bin of the histogram.</w:t>
-      </w:r>
-      <w:r>
-        <w:t xml:space="preserve"> Figure </w:t>
-      </w:r>
-      <w:r>
-        <w:t>3</w:t>
-      </w:r>
-      <w:r>
-        <w:t xml:space="preserve"> is </w:t>
-      </w:r>
-      <w:r>
-        <w:t xml:space="preserve">y-axis </w:t>
-      </w:r>
-      <w:r>
-        <w:t>truncated</w:t>
-      </w:r>
-      <w:r>
-        <w:t xml:space="preserve"> and </w:t>
-      </w:r>
-      <w:r>
-        <w:t xml:space="preserve">nearly 70% of the results have a cone of depression less than 50 m. </w:t>
-      </w:r>
-      <w:r>
-        <w:t>A</w:t>
-      </w:r>
-      <w:r>
-        <w:t>n a</w:t>
-      </w:r>
-      <w:r>
-        <w:t xml:space="preserve">rbitrarily small </w:t>
-      </w:r>
-      <w:r>
-        <w:t>threshold</w:t>
-      </w:r>
-      <w:r>
-        <w:t>,</w:t>
-      </w:r>
-      <w:r>
-        <w:t xml:space="preserve"> such as </w:t>
-      </w:r>
-      <w:r>
-        <w:t>1e-5 m</w:t>
-      </w:r>
-      <w:r>
-        <w:t xml:space="preserve">, </w:t>
-      </w:r>
-      <w:r>
-        <w:t xml:space="preserve">significantly </w:t>
-      </w:r>
-      <w:r>
-        <w:t xml:space="preserve">extends </w:t>
-      </w:r>
-      <w:r>
-        <w:t>the cone of depression to</w:t>
+        <w:t>cone of depression to</w:t>
       </w:r>
       <w:r>
         <w:t xml:space="preserve">wards the </w:t>
@@ -1572,15 +1767,7 @@
         <w:t xml:space="preserve">. </w:t>
       </w:r>
       <w:r>
-        <w:t xml:space="preserve">While a very small threshold can likely be ruled out as </w:t>
-      </w:r>
-      <w:proofErr w:type="spellStart"/>
-      <w:r>
-        <w:t>aphysical</w:t>
-      </w:r>
-      <w:proofErr w:type="spellEnd"/>
-      <w:r>
-        <w:t xml:space="preserve">, how </w:t>
+        <w:t xml:space="preserve">While a very small threshold can likely be ruled out as aphysical, how </w:t>
       </w:r>
       <w:r>
         <w:t>large</w:t>
@@ -1663,8 +1850,17 @@
       </w:r>
     </w:p>
     <w:p>
-      <w:r>
-        <w:t xml:space="preserve">Advective and Diffusive processes mix and homogenous an aquifer. </w:t>
+      <w:pPr>
+        <w:ind w:firstLine="720"/>
+      </w:pPr>
+      <w:r>
+        <w:t xml:space="preserve">Advective and </w:t>
+      </w:r>
+      <w:r>
+        <w:t>d</w:t>
+      </w:r>
+      <w:r>
+        <w:t xml:space="preserve">iffusive processes mix and homogenous an aquifer. </w:t>
       </w:r>
       <w:r>
         <w:t xml:space="preserve">How rapidly and over what length scales this occurs can also serve </w:t>
@@ -1677,8 +1873,14 @@
       </w:r>
     </w:p>
     <w:p>
-      <w:r>
-        <w:t xml:space="preserve">Diffusive processes can be </w:t>
+      <w:pPr>
+        <w:ind w:firstLine="720"/>
+      </w:pPr>
+      <w:r>
+        <w:t>D</w:t>
+      </w:r>
+      <w:r>
+        <w:t xml:space="preserve">iffusive processes can be </w:t>
       </w:r>
       <w:r>
         <w:t>ignored</w:t>
@@ -1847,6 +2049,9 @@
     </w:p>
     <w:p/>
     <w:p>
+      <w:pPr>
+        <w:ind w:firstLine="720"/>
+      </w:pPr>
       <w:r>
         <w:t>Instead</w:t>
       </w:r>
@@ -1879,6 +2084,9 @@
       </w:r>
     </w:p>
     <w:p>
+      <w:pPr>
+        <w:ind w:firstLine="720"/>
+      </w:pPr>
       <w:r>
         <w:t xml:space="preserve">We can estimate groundwater flow with the Darcy equation. </w:t>
       </w:r>
@@ -1913,21 +2121,12 @@
         <w:t>dynamic viscosity (μ)</w:t>
       </w:r>
       <w:r>
-        <w:t>, and hydraulic head gradient (</w:t>
-      </w:r>
-      <w:proofErr w:type="spellStart"/>
-      <w:r>
-        <w:t>Δh</w:t>
-      </w:r>
-      <w:proofErr w:type="spellEnd"/>
-      <w:r>
-        <w:t>)</w:t>
+        <w:t>, and hydraulic head gradient (Δh)</w:t>
       </w:r>
       <w:r>
         <w:t xml:space="preserve">. Permeability </w:t>
       </w:r>
       <w:r>
-        <w:lastRenderedPageBreak/>
         <w:t xml:space="preserve">varies over many orders of magnitude, and dynamic viscosity is affected by temperature and solute content. </w:t>
       </w:r>
       <w:r>
@@ -1992,6 +2191,7 @@
           </w:tcPr>
           <w:p>
             <w:r>
+              <w:lastRenderedPageBreak/>
               <w:t>Pa</w:t>
             </w:r>
             <w:r>
@@ -2033,15 +2233,7 @@
           </w:tcPr>
           <w:p>
             <w:r>
-              <w:t>Hydraulic Gradient (</w:t>
-            </w:r>
-            <w:proofErr w:type="spellStart"/>
-            <w:r>
-              <w:t>Δh</w:t>
-            </w:r>
-            <w:proofErr w:type="spellEnd"/>
-            <w:r>
-              <w:t>)</w:t>
+              <w:t>Hydraulic Gradient (Δh)</w:t>
             </w:r>
           </w:p>
         </w:tc>
@@ -2231,6 +2423,9 @@
     </w:p>
     <w:p/>
     <w:p>
+      <w:pPr>
+        <w:ind w:firstLine="720"/>
+      </w:pPr>
       <w:r>
         <w:t xml:space="preserve">The solution to the darcy equation is a velocity, which is then multiplied by </w:t>
       </w:r>
@@ -2238,7 +2433,19 @@
         <w:t>30</w:t>
       </w:r>
       <w:r>
-        <w:t xml:space="preserve"> years to estimate a representative distance. The median </w:t>
+        <w:t xml:space="preserve"> years to estimate a representative distance. </w:t>
+      </w:r>
+      <w:r>
+        <w:t xml:space="preserve">30 years is roughly the duration that PFAS </w:t>
+      </w:r>
+      <w:r>
+        <w:t xml:space="preserve">has been present in the environment due to sludge spreading and is considered </w:t>
+      </w:r>
+      <w:r>
+        <w:t xml:space="preserve">sufficiently low to have the estimate be conservative. </w:t>
+      </w:r>
+      <w:r>
+        <w:t xml:space="preserve">The median </w:t>
       </w:r>
       <w:r>
         <w:t xml:space="preserve">of the result </w:t>
@@ -2300,7 +2507,7 @@
                     </pic:cNvPicPr>
                   </pic:nvPicPr>
                   <pic:blipFill>
-                    <a:blip r:embed="rId8" cstate="print">
+                    <a:blip r:embed="rId9" cstate="print">
                       <a:extLst>
                         <a:ext uri="{28A0092B-C50C-407E-A947-70E740481C1C}">
                           <a14:useLocalDpi xmlns:a14="http://schemas.microsoft.com/office/drawing/2010/main" val="0"/>
@@ -2337,7 +2544,13 @@
         <w:jc w:val="center"/>
       </w:pPr>
       <w:r>
-        <w:t>Figure 4: Darcy equation Monte Carlo Result.</w:t>
+        <w:t>Figure</w:t>
+      </w:r>
+      <w:r>
+        <w:t xml:space="preserve"> 5</w:t>
+      </w:r>
+      <w:r>
+        <w:t>: Darcy equation Monte Carlo Result.</w:t>
       </w:r>
       <w:r>
         <w:t xml:space="preserve"> There is a long tail with </w:t>
@@ -2363,6 +2576,7 @@
     <w:p/>
     <w:p>
       <w:r>
+        <w:lastRenderedPageBreak/>
         <w:t>The estimate of a</w:t>
       </w:r>
       <w:r>
@@ -2381,28 +2595,28 @@
         <w:t>100 to 200</w:t>
       </w:r>
       <w:r>
-        <w:t xml:space="preserve"> meters. These two values can be additive </w:t>
-      </w:r>
-      <w:r>
-        <w:t>but the final estimate is</w:t>
+        <w:t xml:space="preserve"> meters. These two values can be additive</w:t>
+      </w:r>
+      <w:r>
+        <w:t xml:space="preserve"> with</w:t>
       </w:r>
       <w:r>
         <w:t xml:space="preserve"> </w:t>
       </w:r>
       <w:r>
-        <w:t>li</w:t>
-      </w:r>
-      <w:r>
-        <w:t xml:space="preserve">kely a few hundred </w:t>
-      </w:r>
-      <w:r>
-        <w:t>meters</w:t>
-      </w:r>
-      <w:r>
-        <w:t>, but</w:t>
-      </w:r>
-      <w:r>
-        <w:t xml:space="preserve"> with a possibility of up to 2000 m. </w:t>
+        <w:t>the final estimate</w:t>
+      </w:r>
+      <w:r>
+        <w:t xml:space="preserve"> between</w:t>
+      </w:r>
+      <w:r>
+        <w:t xml:space="preserve"> </w:t>
+      </w:r>
+      <w:r>
+        <w:t>200 and</w:t>
+      </w:r>
+      <w:r>
+        <w:t xml:space="preserve"> 2000 m. </w:t>
       </w:r>
     </w:p>
     <w:p/>
@@ -2500,6 +2714,24 @@
           <w:rFonts w:eastAsiaTheme="minorEastAsia"/>
         </w:rPr>
       </w:pPr>
+      <w:r>
+        <w:rPr>
+          <w:rFonts w:eastAsiaTheme="minorEastAsia"/>
+        </w:rPr>
+        <w:t xml:space="preserve">[[find water samples in a atmospheric deposition bin that does not have </w:t>
+      </w:r>
+      <w:r>
+        <w:rPr>
+          <w:rFonts w:eastAsiaTheme="minorEastAsia"/>
+        </w:rPr>
+        <w:t xml:space="preserve">a spreading field in the bin, and compare the probably of the </w:t>
+      </w:r>
+      <w:r>
+        <w:rPr>
+          <w:rFonts w:eastAsiaTheme="minorEastAsia"/>
+        </w:rPr>
+        <w:t>depositional model to the observed PFAS concentrations]]</w:t>
+      </w:r>
       <w:r>
         <w:rPr>
           <w:rFonts w:eastAsiaTheme="minorEastAsia"/>
@@ -2520,7 +2752,7 @@
         <w:lastRenderedPageBreak/>
         <w:t xml:space="preserve">Schaefer, C.E., Drennan, D.M., Tran, D.N., Garcia, R., Christie, E., Higgins, C.P. and Field, J.A., 2019. Measurement of Aqueous Diffusivities for Perfluoroalkyl Acids. Journal of Environmental Engineering, 145(11). </w:t>
       </w:r>
-      <w:hyperlink r:id="rId9" w:tgtFrame="_blank" w:history="1">
+      <w:hyperlink r:id="rId10" w:tgtFrame="_blank" w:history="1">
         <w:r>
           <w:rPr>
             <w:rStyle w:val="Hyperlink"/>

</xml_diff>